<commit_message>
Grupos de pares por porte e região, com a comparação na conformidade de cada ente (ADR-038)
Cálculo inicial dos grupos de pares, entregável da Fase 1 (RF-EN-02):
municípios por porte (classes do IBGE) e grande região, lida do código IBGE;
grupo regional com menos de 15 municípios recua para o porte no país, com o
motivo nos critérios; estados e DF num grupo; a União sem grupo. A RCL entra
numa próxima versão, com a normalização do RREO.

Na publicação dos painéis, cada ente avaliado na conformidade ganha o bloco
pares, e cada grupo, conformidade/pares/<id>.json. O portal mostra o cartão
Grupo de pares na página do ente (UC-06): a fração no prazo ao lado da
mediana e dos quartis do grupo, os critérios, as ressalvas e a lista dos
entes, por nome. Com o cadastro de outubro de 2026: 33 grupos para os 5.597
entes avaliados. DOC-10 1.6, DOC-13 1.2 e DOC-11 regerados.
</commit_message>
<xml_diff>
--- a/docs/DOC-10_Roadmap.docx
+++ b/docs/DOC-10_Roadmap.docx
@@ -267,7 +267,7 @@
                 <w:sz w:val="19"/>
                 <w:szCs w:val="19"/>
               </w:rPr>
-              <w:t xml:space="preserve">1.5</w:t>
+              <w:t xml:space="preserve">1.6</w:t>
             </w:r>
           </w:p>
         </w:tc>
@@ -326,7 +326,7 @@
                 <w:sz w:val="19"/>
                 <w:szCs w:val="19"/>
               </w:rPr>
-              <w:t xml:space="preserve">16 de outubro de 2026</w:t>
+              <w:t xml:space="preserve">19 de outubro de 2026</w:t>
             </w:r>
           </w:p>
         </w:tc>
@@ -425,9 +425,11 @@
         <w:keepLines/>
         <w:spacing w:after="160" w:before="380"/>
       </w:pPr>
+      <w:bookmarkStart w:name="_Toc1" w:id="1"/>
       <w:r>
         <w:t xml:space="preserve">Sumário</w:t>
       </w:r>
+      <w:bookmarkEnd w:id="1"/>
     </w:p>
     <w:p>
       <w:pPr>
@@ -452,11 +454,666 @@
       </w:sdtPr>
       <w:sdtContent>
         <w:p>
+          <w:pPr>
+            <w:pStyle w:val="TOC1"/>
+            <w:tabs>
+              <w:tab w:val="right" w:pos="9638" w:leader="dot"/>
+            </w:tabs>
+          </w:pPr>
           <w:r>
             <w:fldChar w:fldCharType="begin" w:dirty="true"/>
             <w:instrText xml:space="preserve">TOC \h \o "1-3"</w:instrText>
             <w:fldChar w:fldCharType="separate"/>
           </w:r>
+          <w:hyperlink w:history="1" w:anchor="_Toc1">
+            <w:r>
+              <w:t xml:space="preserve">Sumário</w:t>
+            </w:r>
+            <w:r>
+              <w:tab/>
+            </w:r>
+            <w:r>
+              <w:fldChar w:fldCharType="begin" w:dirty="true"/>
+              <w:instrText xml:space="preserve">PAGEREF _Toc1 \h</w:instrText>
+              <w:fldChar w:fldCharType="separate"/>
+              <w:fldChar w:fldCharType="end"/>
+            </w:r>
+          </w:hyperlink>
+        </w:p>
+        <w:p>
+          <w:pPr>
+            <w:pStyle w:val="TOC1"/>
+            <w:tabs>
+              <w:tab w:val="right" w:pos="9638" w:leader="dot"/>
+            </w:tabs>
+          </w:pPr>
+          <w:hyperlink w:history="1" w:anchor="_Toc2">
+            <w:r>
+              <w:t xml:space="preserve">1. Estratégia do plano</w:t>
+            </w:r>
+            <w:r>
+              <w:tab/>
+            </w:r>
+            <w:r>
+              <w:fldChar w:fldCharType="begin" w:dirty="true"/>
+              <w:instrText xml:space="preserve">PAGEREF _Toc2 \h</w:instrText>
+              <w:fldChar w:fldCharType="separate"/>
+              <w:fldChar w:fldCharType="end"/>
+            </w:r>
+          </w:hyperlink>
+        </w:p>
+        <w:p>
+          <w:pPr>
+            <w:pStyle w:val="TOC1"/>
+            <w:tabs>
+              <w:tab w:val="right" w:pos="9638" w:leader="dot"/>
+            </w:tabs>
+          </w:pPr>
+          <w:hyperlink w:history="1" w:anchor="_Toc3">
+            <w:r>
+              <w:t xml:space="preserve">2. Visão geral do cronograma</w:t>
+            </w:r>
+            <w:r>
+              <w:tab/>
+            </w:r>
+            <w:r>
+              <w:fldChar w:fldCharType="begin" w:dirty="true"/>
+              <w:instrText xml:space="preserve">PAGEREF _Toc3 \h</w:instrText>
+              <w:fldChar w:fldCharType="separate"/>
+              <w:fldChar w:fldCharType="end"/>
+            </w:r>
+          </w:hyperlink>
+        </w:p>
+        <w:p>
+          <w:pPr>
+            <w:pStyle w:val="TOC1"/>
+            <w:tabs>
+              <w:tab w:val="right" w:pos="9638" w:leader="dot"/>
+            </w:tabs>
+          </w:pPr>
+          <w:hyperlink w:history="1" w:anchor="_Toc4">
+            <w:r>
+              <w:t xml:space="preserve">3. Fases detalhadas</w:t>
+            </w:r>
+            <w:r>
+              <w:tab/>
+            </w:r>
+            <w:r>
+              <w:fldChar w:fldCharType="begin" w:dirty="true"/>
+              <w:instrText xml:space="preserve">PAGEREF _Toc4 \h</w:instrText>
+              <w:fldChar w:fldCharType="separate"/>
+              <w:fldChar w:fldCharType="end"/>
+            </w:r>
+          </w:hyperlink>
+        </w:p>
+        <w:p>
+          <w:pPr>
+            <w:pStyle w:val="TOC2"/>
+            <w:tabs>
+              <w:tab w:val="right" w:pos="9638" w:leader="dot"/>
+            </w:tabs>
+            <w:ind w:left="220"/>
+          </w:pPr>
+          <w:hyperlink w:history="1" w:anchor="_Toc5">
+            <w:r>
+              <w:t xml:space="preserve">Fase 0 — Fundação</w:t>
+            </w:r>
+            <w:r>
+              <w:tab/>
+            </w:r>
+            <w:r>
+              <w:fldChar w:fldCharType="begin" w:dirty="true"/>
+              <w:instrText xml:space="preserve">PAGEREF _Toc5 \h</w:instrText>
+              <w:fldChar w:fldCharType="separate"/>
+              <w:fldChar w:fldCharType="end"/>
+            </w:r>
+          </w:hyperlink>
+        </w:p>
+        <w:p>
+          <w:pPr>
+            <w:pStyle w:val="TOC3"/>
+            <w:tabs>
+              <w:tab w:val="right" w:pos="9638" w:leader="dot"/>
+            </w:tabs>
+            <w:ind w:left="440"/>
+          </w:pPr>
+          <w:hyperlink w:history="1" w:anchor="_Toc6">
+            <w:r>
+              <w:t xml:space="preserve">Entregáveis</w:t>
+            </w:r>
+            <w:r>
+              <w:tab/>
+            </w:r>
+            <w:r>
+              <w:fldChar w:fldCharType="begin" w:dirty="true"/>
+              <w:instrText xml:space="preserve">PAGEREF _Toc6 \h</w:instrText>
+              <w:fldChar w:fldCharType="separate"/>
+              <w:fldChar w:fldCharType="end"/>
+            </w:r>
+          </w:hyperlink>
+        </w:p>
+        <w:p>
+          <w:pPr>
+            <w:pStyle w:val="TOC2"/>
+            <w:tabs>
+              <w:tab w:val="right" w:pos="9638" w:leader="dot"/>
+            </w:tabs>
+            <w:ind w:left="220"/>
+          </w:pPr>
+          <w:hyperlink w:history="1" w:anchor="_Toc7">
+            <w:r>
+              <w:t xml:space="preserve">Fase 1 — Espinha dorsal nacional</w:t>
+            </w:r>
+            <w:r>
+              <w:tab/>
+            </w:r>
+            <w:r>
+              <w:fldChar w:fldCharType="begin" w:dirty="true"/>
+              <w:instrText xml:space="preserve">PAGEREF _Toc7 \h</w:instrText>
+              <w:fldChar w:fldCharType="separate"/>
+              <w:fldChar w:fldCharType="end"/>
+            </w:r>
+          </w:hyperlink>
+        </w:p>
+        <w:p>
+          <w:pPr>
+            <w:pStyle w:val="TOC3"/>
+            <w:tabs>
+              <w:tab w:val="right" w:pos="9638" w:leader="dot"/>
+            </w:tabs>
+            <w:ind w:left="440"/>
+          </w:pPr>
+          <w:hyperlink w:history="1" w:anchor="_Toc8">
+            <w:r>
+              <w:t xml:space="preserve">Entregáveis</w:t>
+            </w:r>
+            <w:r>
+              <w:tab/>
+            </w:r>
+            <w:r>
+              <w:fldChar w:fldCharType="begin" w:dirty="true"/>
+              <w:instrText xml:space="preserve">PAGEREF _Toc8 \h</w:instrText>
+              <w:fldChar w:fldCharType="separate"/>
+              <w:fldChar w:fldCharType="end"/>
+            </w:r>
+          </w:hyperlink>
+        </w:p>
+        <w:p>
+          <w:pPr>
+            <w:pStyle w:val="TOC2"/>
+            <w:tabs>
+              <w:tab w:val="right" w:pos="9638" w:leader="dot"/>
+            </w:tabs>
+            <w:ind w:left="220"/>
+          </w:pPr>
+          <w:hyperlink w:history="1" w:anchor="_Toc9">
+            <w:r>
+              <w:t xml:space="preserve">Fase 2 — Motor de detecção</w:t>
+            </w:r>
+            <w:r>
+              <w:tab/>
+            </w:r>
+            <w:r>
+              <w:fldChar w:fldCharType="begin" w:dirty="true"/>
+              <w:instrText xml:space="preserve">PAGEREF _Toc9 \h</w:instrText>
+              <w:fldChar w:fldCharType="separate"/>
+              <w:fldChar w:fldCharType="end"/>
+            </w:r>
+          </w:hyperlink>
+        </w:p>
+        <w:p>
+          <w:pPr>
+            <w:pStyle w:val="TOC3"/>
+            <w:tabs>
+              <w:tab w:val="right" w:pos="9638" w:leader="dot"/>
+            </w:tabs>
+            <w:ind w:left="440"/>
+          </w:pPr>
+          <w:hyperlink w:history="1" w:anchor="_Toc10">
+            <w:r>
+              <w:t xml:space="preserve">Entregáveis</w:t>
+            </w:r>
+            <w:r>
+              <w:tab/>
+            </w:r>
+            <w:r>
+              <w:fldChar w:fldCharType="begin" w:dirty="true"/>
+              <w:instrText xml:space="preserve">PAGEREF _Toc10 \h</w:instrText>
+              <w:fldChar w:fldCharType="separate"/>
+              <w:fldChar w:fldCharType="end"/>
+            </w:r>
+          </w:hyperlink>
+        </w:p>
+        <w:p>
+          <w:pPr>
+            <w:pStyle w:val="TOC2"/>
+            <w:tabs>
+              <w:tab w:val="right" w:pos="9638" w:leader="dot"/>
+            </w:tabs>
+            <w:ind w:left="220"/>
+          </w:pPr>
+          <w:hyperlink w:history="1" w:anchor="_Toc11">
+            <w:r>
+              <w:t xml:space="preserve">Fase 3 — Camada estadual</w:t>
+            </w:r>
+            <w:r>
+              <w:tab/>
+            </w:r>
+            <w:r>
+              <w:fldChar w:fldCharType="begin" w:dirty="true"/>
+              <w:instrText xml:space="preserve">PAGEREF _Toc11 \h</w:instrText>
+              <w:fldChar w:fldCharType="separate"/>
+              <w:fldChar w:fldCharType="end"/>
+            </w:r>
+          </w:hyperlink>
+        </w:p>
+        <w:p>
+          <w:pPr>
+            <w:pStyle w:val="TOC3"/>
+            <w:tabs>
+              <w:tab w:val="right" w:pos="9638" w:leader="dot"/>
+            </w:tabs>
+            <w:ind w:left="440"/>
+          </w:pPr>
+          <w:hyperlink w:history="1" w:anchor="_Toc12">
+            <w:r>
+              <w:t xml:space="preserve">Entregáveis</w:t>
+            </w:r>
+            <w:r>
+              <w:tab/>
+            </w:r>
+            <w:r>
+              <w:fldChar w:fldCharType="begin" w:dirty="true"/>
+              <w:instrText xml:space="preserve">PAGEREF _Toc12 \h</w:instrText>
+              <w:fldChar w:fldCharType="separate"/>
+              <w:fldChar w:fldCharType="end"/>
+            </w:r>
+          </w:hyperlink>
+        </w:p>
+        <w:p>
+          <w:pPr>
+            <w:pStyle w:val="TOC2"/>
+            <w:tabs>
+              <w:tab w:val="right" w:pos="9638" w:leader="dot"/>
+            </w:tabs>
+            <w:ind w:left="220"/>
+          </w:pPr>
+          <w:hyperlink w:history="1" w:anchor="_Toc13">
+            <w:r>
+              <w:t xml:space="preserve">Fase 4 — Cauda longa municipal</w:t>
+            </w:r>
+            <w:r>
+              <w:tab/>
+            </w:r>
+            <w:r>
+              <w:fldChar w:fldCharType="begin" w:dirty="true"/>
+              <w:instrText xml:space="preserve">PAGEREF _Toc13 \h</w:instrText>
+              <w:fldChar w:fldCharType="separate"/>
+              <w:fldChar w:fldCharType="end"/>
+            </w:r>
+          </w:hyperlink>
+        </w:p>
+        <w:p>
+          <w:pPr>
+            <w:pStyle w:val="TOC3"/>
+            <w:tabs>
+              <w:tab w:val="right" w:pos="9638" w:leader="dot"/>
+            </w:tabs>
+            <w:ind w:left="440"/>
+          </w:pPr>
+          <w:hyperlink w:history="1" w:anchor="_Toc14">
+            <w:r>
+              <w:t xml:space="preserve">Entregáveis</w:t>
+            </w:r>
+            <w:r>
+              <w:tab/>
+            </w:r>
+            <w:r>
+              <w:fldChar w:fldCharType="begin" w:dirty="true"/>
+              <w:instrText xml:space="preserve">PAGEREF _Toc14 \h</w:instrText>
+              <w:fldChar w:fldCharType="separate"/>
+              <w:fldChar w:fldCharType="end"/>
+            </w:r>
+          </w:hyperlink>
+        </w:p>
+        <w:p>
+          <w:pPr>
+            <w:pStyle w:val="TOC2"/>
+            <w:tabs>
+              <w:tab w:val="right" w:pos="9638" w:leader="dot"/>
+            </w:tabs>
+            <w:ind w:left="220"/>
+          </w:pPr>
+          <w:hyperlink w:history="1" w:anchor="_Toc15">
+            <w:r>
+              <w:t xml:space="preserve">Fase 5 — Publicação</w:t>
+            </w:r>
+            <w:r>
+              <w:tab/>
+            </w:r>
+            <w:r>
+              <w:fldChar w:fldCharType="begin" w:dirty="true"/>
+              <w:instrText xml:space="preserve">PAGEREF _Toc15 \h</w:instrText>
+              <w:fldChar w:fldCharType="separate"/>
+              <w:fldChar w:fldCharType="end"/>
+            </w:r>
+          </w:hyperlink>
+        </w:p>
+        <w:p>
+          <w:pPr>
+            <w:pStyle w:val="TOC3"/>
+            <w:tabs>
+              <w:tab w:val="right" w:pos="9638" w:leader="dot"/>
+            </w:tabs>
+            <w:ind w:left="440"/>
+          </w:pPr>
+          <w:hyperlink w:history="1" w:anchor="_Toc16">
+            <w:r>
+              <w:t xml:space="preserve">Entregáveis</w:t>
+            </w:r>
+            <w:r>
+              <w:tab/>
+            </w:r>
+            <w:r>
+              <w:fldChar w:fldCharType="begin" w:dirty="true"/>
+              <w:instrText xml:space="preserve">PAGEREF _Toc16 \h</w:instrText>
+              <w:fldChar w:fldCharType="separate"/>
+              <w:fldChar w:fldCharType="end"/>
+            </w:r>
+          </w:hyperlink>
+        </w:p>
+        <w:p>
+          <w:pPr>
+            <w:pStyle w:val="TOC2"/>
+            <w:tabs>
+              <w:tab w:val="right" w:pos="9638" w:leader="dot"/>
+            </w:tabs>
+            <w:ind w:left="220"/>
+          </w:pPr>
+          <w:hyperlink w:history="1" w:anchor="_Toc17">
+            <w:r>
+              <w:t xml:space="preserve">Fase 6 — Consolidação</w:t>
+            </w:r>
+            <w:r>
+              <w:tab/>
+            </w:r>
+            <w:r>
+              <w:fldChar w:fldCharType="begin" w:dirty="true"/>
+              <w:instrText xml:space="preserve">PAGEREF _Toc17 \h</w:instrText>
+              <w:fldChar w:fldCharType="separate"/>
+              <w:fldChar w:fldCharType="end"/>
+            </w:r>
+          </w:hyperlink>
+        </w:p>
+        <w:p>
+          <w:pPr>
+            <w:pStyle w:val="TOC3"/>
+            <w:tabs>
+              <w:tab w:val="right" w:pos="9638" w:leader="dot"/>
+            </w:tabs>
+            <w:ind w:left="440"/>
+          </w:pPr>
+          <w:hyperlink w:history="1" w:anchor="_Toc18">
+            <w:r>
+              <w:t xml:space="preserve">Entregáveis</w:t>
+            </w:r>
+            <w:r>
+              <w:tab/>
+            </w:r>
+            <w:r>
+              <w:fldChar w:fldCharType="begin" w:dirty="true"/>
+              <w:instrText xml:space="preserve">PAGEREF _Toc18 \h</w:instrText>
+              <w:fldChar w:fldCharType="separate"/>
+              <w:fldChar w:fldCharType="end"/>
+            </w:r>
+          </w:hyperlink>
+        </w:p>
+        <w:p>
+          <w:pPr>
+            <w:pStyle w:val="TOC1"/>
+            <w:tabs>
+              <w:tab w:val="right" w:pos="9638" w:leader="dot"/>
+            </w:tabs>
+          </w:pPr>
+          <w:hyperlink w:history="1" w:anchor="_Toc19">
+            <w:r>
+              <w:t xml:space="preserve">4. Marcos</w:t>
+            </w:r>
+            <w:r>
+              <w:tab/>
+            </w:r>
+            <w:r>
+              <w:fldChar w:fldCharType="begin" w:dirty="true"/>
+              <w:instrText xml:space="preserve">PAGEREF _Toc19 \h</w:instrText>
+              <w:fldChar w:fldCharType="separate"/>
+              <w:fldChar w:fldCharType="end"/>
+            </w:r>
+          </w:hyperlink>
+        </w:p>
+        <w:p>
+          <w:pPr>
+            <w:pStyle w:val="TOC1"/>
+            <w:tabs>
+              <w:tab w:val="right" w:pos="9638" w:leader="dot"/>
+            </w:tabs>
+          </w:pPr>
+          <w:hyperlink w:history="1" w:anchor="_Toc20">
+            <w:r>
+              <w:t xml:space="preserve">5. Esforço estimado</w:t>
+            </w:r>
+            <w:r>
+              <w:tab/>
+            </w:r>
+            <w:r>
+              <w:fldChar w:fldCharType="begin" w:dirty="true"/>
+              <w:instrText xml:space="preserve">PAGEREF _Toc20 \h</w:instrText>
+              <w:fldChar w:fldCharType="separate"/>
+              <w:fldChar w:fldCharType="end"/>
+            </w:r>
+          </w:hyperlink>
+        </w:p>
+        <w:p>
+          <w:pPr>
+            <w:pStyle w:val="TOC1"/>
+            <w:tabs>
+              <w:tab w:val="right" w:pos="9638" w:leader="dot"/>
+            </w:tabs>
+          </w:pPr>
+          <w:hyperlink w:history="1" w:anchor="_Toc21">
+            <w:r>
+              <w:t xml:space="preserve">6. Custos recorrentes estimados</w:t>
+            </w:r>
+            <w:r>
+              <w:tab/>
+            </w:r>
+            <w:r>
+              <w:fldChar w:fldCharType="begin" w:dirty="true"/>
+              <w:instrText xml:space="preserve">PAGEREF _Toc21 \h</w:instrText>
+              <w:fldChar w:fldCharType="separate"/>
+              <w:fldChar w:fldCharType="end"/>
+            </w:r>
+          </w:hyperlink>
+        </w:p>
+        <w:p>
+          <w:pPr>
+            <w:pStyle w:val="TOC1"/>
+            <w:tabs>
+              <w:tab w:val="right" w:pos="9638" w:leader="dot"/>
+            </w:tabs>
+          </w:pPr>
+          <w:hyperlink w:history="1" w:anchor="_Toc22">
+            <w:r>
+              <w:t xml:space="preserve">7. Decisões que precisam ser tomadas antes de começar</w:t>
+            </w:r>
+            <w:r>
+              <w:tab/>
+            </w:r>
+            <w:r>
+              <w:fldChar w:fldCharType="begin" w:dirty="true"/>
+              <w:instrText xml:space="preserve">PAGEREF _Toc22 \h</w:instrText>
+              <w:fldChar w:fldCharType="separate"/>
+              <w:fldChar w:fldCharType="end"/>
+            </w:r>
+          </w:hyperlink>
+        </w:p>
+        <w:p>
+          <w:pPr>
+            <w:pStyle w:val="TOC1"/>
+            <w:tabs>
+              <w:tab w:val="right" w:pos="9638" w:leader="dot"/>
+            </w:tabs>
+          </w:pPr>
+          <w:hyperlink w:history="1" w:anchor="_Toc23">
+            <w:r>
+              <w:t xml:space="preserve">8. Critérios de replanejamento</w:t>
+            </w:r>
+            <w:r>
+              <w:tab/>
+            </w:r>
+            <w:r>
+              <w:fldChar w:fldCharType="begin" w:dirty="true"/>
+              <w:instrText xml:space="preserve">PAGEREF _Toc23 \h</w:instrText>
+              <w:fldChar w:fldCharType="separate"/>
+              <w:fldChar w:fldCharType="end"/>
+            </w:r>
+          </w:hyperlink>
+        </w:p>
+        <w:p>
+          <w:pPr>
+            <w:pStyle w:val="TOC1"/>
+            <w:tabs>
+              <w:tab w:val="right" w:pos="9638" w:leader="dot"/>
+            </w:tabs>
+          </w:pPr>
+          <w:hyperlink w:history="1" w:anchor="_Toc24">
+            <w:r>
+              <w:t xml:space="preserve">9. Situação em 19 de outubro de 2026</w:t>
+            </w:r>
+            <w:r>
+              <w:tab/>
+            </w:r>
+            <w:r>
+              <w:fldChar w:fldCharType="begin" w:dirty="true"/>
+              <w:instrText xml:space="preserve">PAGEREF _Toc24 \h</w:instrText>
+              <w:fldChar w:fldCharType="separate"/>
+              <w:fldChar w:fldCharType="end"/>
+            </w:r>
+          </w:hyperlink>
+        </w:p>
+        <w:p>
+          <w:pPr>
+            <w:pStyle w:val="TOC2"/>
+            <w:tabs>
+              <w:tab w:val="right" w:pos="9638" w:leader="dot"/>
+            </w:tabs>
+            <w:ind w:left="220"/>
+          </w:pPr>
+          <w:hyperlink w:history="1" w:anchor="_Toc25">
+            <w:r>
+              <w:t xml:space="preserve">9.1 Fase 0 — Fundação: concluída</w:t>
+            </w:r>
+            <w:r>
+              <w:tab/>
+            </w:r>
+            <w:r>
+              <w:fldChar w:fldCharType="begin" w:dirty="true"/>
+              <w:instrText xml:space="preserve">PAGEREF _Toc25 \h</w:instrText>
+              <w:fldChar w:fldCharType="separate"/>
+              <w:fldChar w:fldCharType="end"/>
+            </w:r>
+          </w:hyperlink>
+        </w:p>
+        <w:p>
+          <w:pPr>
+            <w:pStyle w:val="TOC2"/>
+            <w:tabs>
+              <w:tab w:val="right" w:pos="9638" w:leader="dot"/>
+            </w:tabs>
+            <w:ind w:left="220"/>
+          </w:pPr>
+          <w:hyperlink w:history="1" w:anchor="_Toc26">
+            <w:r>
+              <w:t xml:space="preserve">9.2 Fase 1 — Espinha dorsal nacional: núcleo pronto</w:t>
+            </w:r>
+            <w:r>
+              <w:tab/>
+            </w:r>
+            <w:r>
+              <w:fldChar w:fldCharType="begin" w:dirty="true"/>
+              <w:instrText xml:space="preserve">PAGEREF _Toc26 \h</w:instrText>
+              <w:fldChar w:fldCharType="separate"/>
+              <w:fldChar w:fldCharType="end"/>
+            </w:r>
+          </w:hyperlink>
+        </w:p>
+        <w:p>
+          <w:pPr>
+            <w:pStyle w:val="TOC2"/>
+            <w:tabs>
+              <w:tab w:val="right" w:pos="9638" w:leader="dot"/>
+            </w:tabs>
+            <w:ind w:left="220"/>
+          </w:pPr>
+          <w:hyperlink w:history="1" w:anchor="_Toc27">
+            <w:r>
+              <w:t xml:space="preserve">9.3 Trilha paralela: aba Eleições</w:t>
+            </w:r>
+            <w:r>
+              <w:tab/>
+            </w:r>
+            <w:r>
+              <w:fldChar w:fldCharType="begin" w:dirty="true"/>
+              <w:instrText xml:space="preserve">PAGEREF _Toc27 \h</w:instrText>
+              <w:fldChar w:fldCharType="separate"/>
+              <w:fldChar w:fldCharType="end"/>
+            </w:r>
+          </w:hyperlink>
+        </w:p>
+        <w:p>
+          <w:pPr>
+            <w:pStyle w:val="TOC2"/>
+            <w:tabs>
+              <w:tab w:val="right" w:pos="9638" w:leader="dot"/>
+            </w:tabs>
+            <w:ind w:left="220"/>
+          </w:pPr>
+          <w:hyperlink w:history="1" w:anchor="_Toc28">
+            <w:r>
+              <w:t xml:space="preserve">9.4 Efeito no cronograma</w:t>
+            </w:r>
+            <w:r>
+              <w:tab/>
+            </w:r>
+            <w:r>
+              <w:fldChar w:fldCharType="begin" w:dirty="true"/>
+              <w:instrText xml:space="preserve">PAGEREF _Toc28 \h</w:instrText>
+              <w:fldChar w:fldCharType="separate"/>
+              <w:fldChar w:fldCharType="end"/>
+            </w:r>
+          </w:hyperlink>
+        </w:p>
+        <w:p>
+          <w:pPr>
+            <w:pStyle w:val="TOC2"/>
+            <w:tabs>
+              <w:tab w:val="right" w:pos="9638" w:leader="dot"/>
+            </w:tabs>
+            <w:ind w:left="220"/>
+          </w:pPr>
+          <w:hyperlink w:history="1" w:anchor="_Toc29">
+            <w:r>
+              <w:t xml:space="preserve">9.5 Hospedagem sem custo (ADR-026)</w:t>
+            </w:r>
+            <w:r>
+              <w:tab/>
+            </w:r>
+            <w:r>
+              <w:fldChar w:fldCharType="begin" w:dirty="true"/>
+              <w:instrText xml:space="preserve">PAGEREF _Toc29 \h</w:instrText>
+              <w:fldChar w:fldCharType="separate"/>
+              <w:fldChar w:fldCharType="end"/>
+            </w:r>
+          </w:hyperlink>
         </w:p>
         <w:p>
           <w:r>
@@ -477,9 +1134,11 @@
         <w:keepLines/>
         <w:spacing w:after="160" w:before="380"/>
       </w:pPr>
+      <w:bookmarkStart w:name="_Toc2" w:id="2"/>
       <w:r>
         <w:t xml:space="preserve">1. Estratégia do plano</w:t>
       </w:r>
+      <w:bookmarkEnd w:id="2"/>
     </w:p>
     <w:p>
       <w:pPr>
@@ -624,9 +1283,11 @@
         <w:keepLines/>
         <w:spacing w:after="160" w:before="380"/>
       </w:pPr>
+      <w:bookmarkStart w:name="_Toc3" w:id="3"/>
       <w:r>
         <w:t xml:space="preserve">2. Visão geral do cronograma</w:t>
       </w:r>
+      <w:bookmarkEnd w:id="3"/>
     </w:p>
     <w:p>
       <w:pPr>
@@ -702,9 +1363,11 @@
         <w:keepLines/>
         <w:spacing w:after="160" w:before="380"/>
       </w:pPr>
+      <w:bookmarkStart w:name="_Toc4" w:id="4"/>
       <w:r>
         <w:t xml:space="preserve">3. Fases detalhadas</w:t>
       </w:r>
+      <w:bookmarkEnd w:id="4"/>
     </w:p>
     <w:p>
       <w:pPr>
@@ -713,9 +1376,11 @@
         <w:keepLines/>
         <w:spacing w:after="120" w:before="280"/>
       </w:pPr>
+      <w:bookmarkStart w:name="_Toc5" w:id="5"/>
       <w:r>
         <w:t xml:space="preserve">Fase 0 — Fundação</w:t>
       </w:r>
+      <w:bookmarkEnd w:id="5"/>
     </w:p>
     <w:tbl>
       <w:tblPr>
@@ -977,9 +1642,11 @@
         <w:keepLines/>
         <w:spacing w:after="100" w:before="220"/>
       </w:pPr>
+      <w:bookmarkStart w:name="_Toc6" w:id="6"/>
       <w:r>
         <w:t xml:space="preserve">Entregáveis</w:t>
       </w:r>
+      <w:bookmarkEnd w:id="6"/>
     </w:p>
     <w:p>
       <w:pPr>
@@ -1071,9 +1738,11 @@
         <w:keepLines/>
         <w:spacing w:after="120" w:before="280"/>
       </w:pPr>
+      <w:bookmarkStart w:name="_Toc7" w:id="7"/>
       <w:r>
         <w:t xml:space="preserve">Fase 1 — Espinha dorsal nacional</w:t>
       </w:r>
+      <w:bookmarkEnd w:id="7"/>
     </w:p>
     <w:tbl>
       <w:tblPr>
@@ -1335,9 +2004,11 @@
         <w:keepLines/>
         <w:spacing w:after="100" w:before="220"/>
       </w:pPr>
+      <w:bookmarkStart w:name="_Toc8" w:id="8"/>
       <w:r>
         <w:t xml:space="preserve">Entregáveis</w:t>
       </w:r>
+      <w:bookmarkEnd w:id="8"/>
     </w:p>
     <w:p>
       <w:pPr>
@@ -1455,9 +2126,11 @@
         <w:keepLines/>
         <w:spacing w:after="120" w:before="280"/>
       </w:pPr>
+      <w:bookmarkStart w:name="_Toc9" w:id="9"/>
       <w:r>
         <w:t xml:space="preserve">Fase 2 — Motor de detecção</w:t>
       </w:r>
+      <w:bookmarkEnd w:id="9"/>
     </w:p>
     <w:tbl>
       <w:tblPr>
@@ -1719,9 +2392,11 @@
         <w:keepLines/>
         <w:spacing w:after="100" w:before="220"/>
       </w:pPr>
+      <w:bookmarkStart w:name="_Toc10" w:id="10"/>
       <w:r>
         <w:t xml:space="preserve">Entregáveis</w:t>
       </w:r>
+      <w:bookmarkEnd w:id="10"/>
     </w:p>
     <w:p>
       <w:pPr>
@@ -1839,9 +2514,11 @@
         <w:keepLines/>
         <w:spacing w:after="120" w:before="280"/>
       </w:pPr>
+      <w:bookmarkStart w:name="_Toc11" w:id="11"/>
       <w:r>
         <w:t xml:space="preserve">Fase 3 — Camada estadual</w:t>
       </w:r>
+      <w:bookmarkEnd w:id="11"/>
     </w:p>
     <w:tbl>
       <w:tblPr>
@@ -2103,9 +2780,11 @@
         <w:keepLines/>
         <w:spacing w:after="100" w:before="220"/>
       </w:pPr>
+      <w:bookmarkStart w:name="_Toc12" w:id="12"/>
       <w:r>
         <w:t xml:space="preserve">Entregáveis</w:t>
       </w:r>
+      <w:bookmarkEnd w:id="12"/>
     </w:p>
     <w:p>
       <w:pPr>
@@ -2184,9 +2863,11 @@
         <w:keepLines/>
         <w:spacing w:after="120" w:before="280"/>
       </w:pPr>
+      <w:bookmarkStart w:name="_Toc13" w:id="13"/>
       <w:r>
         <w:t xml:space="preserve">Fase 4 — Cauda longa municipal</w:t>
       </w:r>
+      <w:bookmarkEnd w:id="13"/>
     </w:p>
     <w:tbl>
       <w:tblPr>
@@ -2448,9 +3129,11 @@
         <w:keepLines/>
         <w:spacing w:after="100" w:before="220"/>
       </w:pPr>
+      <w:bookmarkStart w:name="_Toc14" w:id="14"/>
       <w:r>
         <w:t xml:space="preserve">Entregáveis</w:t>
       </w:r>
+      <w:bookmarkEnd w:id="14"/>
     </w:p>
     <w:p>
       <w:pPr>
@@ -2529,9 +3212,11 @@
         <w:keepLines/>
         <w:spacing w:after="120" w:before="280"/>
       </w:pPr>
+      <w:bookmarkStart w:name="_Toc15" w:id="15"/>
       <w:r>
         <w:t xml:space="preserve">Fase 5 — Publicação</w:t>
       </w:r>
+      <w:bookmarkEnd w:id="15"/>
     </w:p>
     <w:tbl>
       <w:tblPr>
@@ -2793,9 +3478,11 @@
         <w:keepLines/>
         <w:spacing w:after="100" w:before="220"/>
       </w:pPr>
+      <w:bookmarkStart w:name="_Toc16" w:id="16"/>
       <w:r>
         <w:t xml:space="preserve">Entregáveis</w:t>
       </w:r>
+      <w:bookmarkEnd w:id="16"/>
     </w:p>
     <w:p>
       <w:pPr>
@@ -2900,9 +3587,11 @@
         <w:keepLines/>
         <w:spacing w:after="120" w:before="280"/>
       </w:pPr>
+      <w:bookmarkStart w:name="_Toc17" w:id="17"/>
       <w:r>
         <w:t xml:space="preserve">Fase 6 — Consolidação</w:t>
       </w:r>
+      <w:bookmarkEnd w:id="17"/>
     </w:p>
     <w:tbl>
       <w:tblPr>
@@ -3164,9 +3853,11 @@
         <w:keepLines/>
         <w:spacing w:after="100" w:before="220"/>
       </w:pPr>
+      <w:bookmarkStart w:name="_Toc18" w:id="18"/>
       <w:r>
         <w:t xml:space="preserve">Entregáveis</w:t>
       </w:r>
+      <w:bookmarkEnd w:id="18"/>
     </w:p>
     <w:p>
       <w:pPr>
@@ -3250,9 +3941,11 @@
         <w:keepLines/>
         <w:spacing w:after="160" w:before="380"/>
       </w:pPr>
+      <w:bookmarkStart w:name="_Toc19" w:id="19"/>
       <w:r>
         <w:t xml:space="preserve">4. Marcos</w:t>
       </w:r>
+      <w:bookmarkEnd w:id="19"/>
     </w:p>
     <w:tbl>
       <w:tblPr>
@@ -3884,9 +4577,11 @@
         <w:keepLines/>
         <w:spacing w:after="160" w:before="380"/>
       </w:pPr>
+      <w:bookmarkStart w:name="_Toc20" w:id="20"/>
       <w:r>
         <w:t xml:space="preserve">5. Esforço estimado</w:t>
       </w:r>
+      <w:bookmarkEnd w:id="20"/>
     </w:p>
     <w:p>
       <w:pPr>
@@ -4758,9 +5453,11 @@
         <w:keepLines/>
         <w:spacing w:after="160" w:before="380"/>
       </w:pPr>
+      <w:bookmarkStart w:name="_Toc21" w:id="21"/>
       <w:r>
         <w:t xml:space="preserve">6. Custos recorrentes estimados</w:t>
       </w:r>
+      <w:bookmarkEnd w:id="21"/>
     </w:p>
     <w:p>
       <w:pPr>
@@ -5743,9 +6440,11 @@
         <w:keepLines/>
         <w:spacing w:after="160" w:before="380"/>
       </w:pPr>
+      <w:bookmarkStart w:name="_Toc22" w:id="22"/>
       <w:r>
         <w:t xml:space="preserve">7. Decisões que precisam ser tomadas antes de começar</w:t>
       </w:r>
+      <w:bookmarkEnd w:id="22"/>
     </w:p>
     <w:p>
       <w:pPr>
@@ -6219,9 +6918,11 @@
         <w:keepLines/>
         <w:spacing w:after="160" w:before="380"/>
       </w:pPr>
+      <w:bookmarkStart w:name="_Toc23" w:id="23"/>
       <w:r>
         <w:t xml:space="preserve">8. Critérios de replanejamento</w:t>
       </w:r>
+      <w:bookmarkEnd w:id="23"/>
     </w:p>
     <w:p>
       <w:pPr>
@@ -6359,9 +7060,11 @@
         <w:pageBreakBefore/>
         <w:spacing w:after="160" w:before="380"/>
       </w:pPr>
-      <w:r>
-        <w:t xml:space="preserve">9. Situação em 9 de outubro de 2026</w:t>
-      </w:r>
+      <w:bookmarkStart w:name="_Toc24" w:id="24"/>
+      <w:r>
+        <w:t xml:space="preserve">9. Situação em 19 de outubro de 2026</w:t>
+      </w:r>
+      <w:bookmarkEnd w:id="24"/>
     </w:p>
     <w:p>
       <w:pPr>
@@ -6384,9 +7087,11 @@
         <w:keepLines/>
         <w:spacing w:after="120" w:before="280"/>
       </w:pPr>
+      <w:bookmarkStart w:name="_Toc25" w:id="25"/>
       <w:r>
         <w:t xml:space="preserve">9.1 Fase 0 — Fundação: concluída</w:t>
       </w:r>
+      <w:bookmarkEnd w:id="25"/>
     </w:p>
     <w:tbl>
       <w:tblPr>
@@ -6886,9 +7591,11 @@
         <w:keepLines/>
         <w:spacing w:after="120" w:before="280"/>
       </w:pPr>
+      <w:bookmarkStart w:name="_Toc26" w:id="26"/>
       <w:r>
         <w:t xml:space="preserve">9.2 Fase 1 — Espinha dorsal nacional: núcleo pronto</w:t>
       </w:r>
+      <w:bookmarkEnd w:id="26"/>
     </w:p>
     <w:tbl>
       <w:tblPr>
@@ -7375,7 +8082,7 @@
                 <w:sz w:val="17"/>
                 <w:szCs w:val="17"/>
               </w:rPr>
-              <w:t xml:space="preserve">Pendente</w:t>
+              <w:t xml:space="preserve">Cálculo inicial concluído (ADR-038): municípios por porte e região, com recuo para o porte no país abaixo de 15 entes; estados e DF num grupo; 33 grupos sobre o cadastro de outubro de 2026. Comparação publicada na conformidade de cada ente. A receita corrente líquida entra com a normalização do RREO</w:t>
             </w:r>
           </w:p>
         </w:tc>
@@ -7868,9 +8575,11 @@
         <w:keepLines/>
         <w:spacing w:after="120" w:before="280"/>
       </w:pPr>
+      <w:bookmarkStart w:name="_Toc27" w:id="27"/>
       <w:r>
         <w:t xml:space="preserve">9.3 Trilha paralela: aba Eleições</w:t>
       </w:r>
+      <w:bookmarkEnd w:id="27"/>
     </w:p>
     <w:p>
       <w:pPr>
@@ -8253,7 +8962,7 @@
                 <w:sz w:val="17"/>
                 <w:szCs w:val="17"/>
               </w:rPr>
-              <w:t xml:space="preserve">Implementado e testado: publicação no R2 só do que mudou, carga retomável no GitHub Actions, portal no Cloudflare Pages. Faltam as contas e os segredos</w:t>
+              <w:t xml:space="preserve">Em produção desde 14/10/2026: feeds no Supabase Storage, carga diária e retomável no GitHub Actions, portal na Vercel</w:t>
             </w:r>
           </w:p>
         </w:tc>
@@ -8430,7 +9139,7 @@
                 <w:sz w:val="17"/>
                 <w:szCs w:val="17"/>
               </w:rPr>
-              <w:t xml:space="preserve">Pendente</w:t>
+              <w:t xml:space="preserve">Feito com o 1º turno (16 e 17/10/2026), que achou a parada sem a marca de finalizada do TSE, já corrigida. O 2º turno está agendado no eleicoes-ao-vivo (adendo do ADR-026)</w:t>
             </w:r>
           </w:p>
         </w:tc>
@@ -8502,9 +9211,11 @@
         <w:keepLines/>
         <w:spacing w:after="120" w:before="280"/>
       </w:pPr>
+      <w:bookmarkStart w:name="_Toc28" w:id="28"/>
       <w:r>
         <w:t xml:space="preserve">9.4 Efeito no cronograma</w:t>
       </w:r>
+      <w:bookmarkEnd w:id="28"/>
     </w:p>
     <w:p>
       <w:pPr>
@@ -8527,9 +9238,11 @@
         <w:keepLines/>
         <w:spacing w:after="120" w:before="280"/>
       </w:pPr>
+      <w:bookmarkStart w:name="_Toc29" w:id="29"/>
       <w:r>
         <w:t xml:space="preserve">9.5 Hospedagem sem custo (ADR-026)</w:t>
       </w:r>
+      <w:bookmarkEnd w:id="29"/>
     </w:p>
     <w:p>
       <w:pPr>
@@ -9477,6 +10190,21 @@
   <w:style w:type="paragraph" w:styleId="Normal" w:default="1">
     <w:name w:val="Normal"/>
     <w:qFormat/>
+  </w:style>
+  <w:style w:type="table" w:styleId="TableNormal" w:default="true">
+    <w:name w:val="Normal Table"/>
+    <w:uiPriority w:val="99"/>
+    <w:semiHidden/>
+    <w:unhideWhenUsed/>
+    <w:tblPr>
+      <w:tblInd w:type="dxa" w:w="0"/>
+      <w:tblCellMar>
+        <w:top w:type="dxa" w:w="0"/>
+        <w:left w:type="dxa" w:w="108"/>
+        <w:bottom w:type="dxa" w:w="0"/>
+        <w:right w:type="dxa" w:w="108"/>
+      </w:tblCellMar>
+    </w:tblPr>
   </w:style>
   <w:style w:type="paragraph" w:styleId="Title">
     <w:name w:val="Title"/>

</xml_diff>

<commit_message>
Situação das coletas: o painel operacional da Fase 1 (ADR-039)
Página nova /operacao/ (link no rodapé), refeita a cada publicação dos
painéis, a partir de operacao.json: os alertas; as execuções dos fluxos de
dados em 30 dias, com a última, a última com sucesso, as falhas e o atraso
dos diários; o volume diário do PNCP contra a mediana do mesmo dia da semana
em 8 semanas, com feriados, pontos facultativos e pontes nacionais de fora;
e a coleta da conformidade por UF. O paineis-site grava as execuções com
gh run list (permissão actions: read nele e nos fluxos que o chamam).

O alarme de volume, simulado nos 289 dias do PNCP de 2026, não dá alerta
falso em 172 dias úteis. Na primeira montagem com os dados reais, o painel
mostrou os testes de contrato falhando, a última carga por período com
falha e o dia 10/04/2026 sem coleta. DOC-10 1.7, DOC-13 1.3 e DOC-11
regerados.
</commit_message>
<xml_diff>
--- a/docs/DOC-10_Roadmap.docx
+++ b/docs/DOC-10_Roadmap.docx
@@ -267,7 +267,7 @@
                 <w:sz w:val="19"/>
                 <w:szCs w:val="19"/>
               </w:rPr>
-              <w:t xml:space="preserve">1.6</w:t>
+              <w:t xml:space="preserve">1.7</w:t>
             </w:r>
           </w:p>
         </w:tc>
@@ -326,7 +326,7 @@
                 <w:sz w:val="19"/>
                 <w:szCs w:val="19"/>
               </w:rPr>
-              <w:t xml:space="preserve">19 de outubro de 2026</w:t>
+              <w:t xml:space="preserve">20 de outubro de 2026</w:t>
             </w:r>
           </w:p>
         </w:tc>
@@ -987,7 +987,7 @@
           </w:pPr>
           <w:hyperlink w:history="1" w:anchor="_Toc24">
             <w:r>
-              <w:t xml:space="preserve">9. Situação em 19 de outubro de 2026</w:t>
+              <w:t xml:space="preserve">9. Situação em 20 de outubro de 2026</w:t>
             </w:r>
             <w:r>
               <w:tab/>
@@ -7062,7 +7062,7 @@
       </w:pPr>
       <w:bookmarkStart w:name="_Toc24" w:id="24"/>
       <w:r>
-        <w:t xml:space="preserve">9. Situação em 19 de outubro de 2026</w:t>
+        <w:t xml:space="preserve">9. Situação em 20 de outubro de 2026</w:t>
       </w:r>
       <w:bookmarkEnd w:id="24"/>
     </w:p>
@@ -8141,7 +8141,7 @@
                 <w:sz w:val="17"/>
                 <w:szCs w:val="17"/>
               </w:rPr>
-              <w:t xml:space="preserve">Pendente</w:t>
+              <w:t xml:space="preserve">Concluído (ADR-039): página pública "Situação das coletas" com as execuções dos fluxos, o volume diário do PNCP contra o usual (alarme de queda, sem falso positivo em 172 dias úteis de 2026) e a coleta da conformidade; limiares iniciais</w:t>
             </w:r>
           </w:p>
         </w:tc>

</xml_diff>

<commit_message>
Situação das coletas: cobertura por ente e UF (ADR-048)
- cobertura.json, gerado pelo publicar: por estado, DF e município, os anos com
  publicação no PNCP, os exercícios do extrato coletados, a DCA, o RGF e a RCL, e a
  marca dos municípios com até 20 mil habitantes (Lei 14.133, art. 176); somas por
  UF e do Brasil, a União à parte.
- Na Situação das coletas, a seção "Cobertura por ente e UF": filtro do dado e dos
  entes, a fração com publicação no PNCP ano a ano, a tabela por UF e a lista dos
  entes sem o dado, com o link para a página de cada um.
- É o relatório do critério de saída da Fase 1 (DOC-10), ao lado da carga desde 2021.
</commit_message>
<xml_diff>
--- a/docs/DOC-10_Roadmap.docx
+++ b/docs/DOC-10_Roadmap.docx
@@ -267,7 +267,7 @@
                 <w:sz w:val="19"/>
                 <w:szCs w:val="19"/>
               </w:rPr>
-              <w:t xml:space="preserve">2.1</w:t>
+              <w:t xml:space="preserve">2.2</w:t>
             </w:r>
           </w:p>
         </w:tc>
@@ -425,9 +425,11 @@
         <w:keepLines/>
         <w:spacing w:after="160" w:before="380"/>
       </w:pPr>
+      <w:bookmarkStart w:name="_Toc1" w:id="1"/>
       <w:r>
         <w:t xml:space="preserve">Sumário</w:t>
       </w:r>
+      <w:bookmarkEnd w:id="1"/>
     </w:p>
     <w:p>
       <w:pPr>
@@ -452,11 +454,666 @@
       </w:sdtPr>
       <w:sdtContent>
         <w:p>
+          <w:pPr>
+            <w:pStyle w:val="TOC1"/>
+            <w:tabs>
+              <w:tab w:val="right" w:pos="9638" w:leader="dot"/>
+            </w:tabs>
+          </w:pPr>
           <w:r>
             <w:fldChar w:fldCharType="begin" w:dirty="true"/>
             <w:instrText xml:space="preserve">TOC \h \o "1-3"</w:instrText>
             <w:fldChar w:fldCharType="separate"/>
           </w:r>
+          <w:hyperlink w:history="1" w:anchor="_Toc1">
+            <w:r>
+              <w:t xml:space="preserve">Sumário</w:t>
+            </w:r>
+            <w:r>
+              <w:tab/>
+            </w:r>
+            <w:r>
+              <w:fldChar w:fldCharType="begin" w:dirty="true"/>
+              <w:instrText xml:space="preserve">PAGEREF _Toc1 \h</w:instrText>
+              <w:fldChar w:fldCharType="separate"/>
+              <w:fldChar w:fldCharType="end"/>
+            </w:r>
+          </w:hyperlink>
+        </w:p>
+        <w:p>
+          <w:pPr>
+            <w:pStyle w:val="TOC1"/>
+            <w:tabs>
+              <w:tab w:val="right" w:pos="9638" w:leader="dot"/>
+            </w:tabs>
+          </w:pPr>
+          <w:hyperlink w:history="1" w:anchor="_Toc2">
+            <w:r>
+              <w:t xml:space="preserve">1. Estratégia do plano</w:t>
+            </w:r>
+            <w:r>
+              <w:tab/>
+            </w:r>
+            <w:r>
+              <w:fldChar w:fldCharType="begin" w:dirty="true"/>
+              <w:instrText xml:space="preserve">PAGEREF _Toc2 \h</w:instrText>
+              <w:fldChar w:fldCharType="separate"/>
+              <w:fldChar w:fldCharType="end"/>
+            </w:r>
+          </w:hyperlink>
+        </w:p>
+        <w:p>
+          <w:pPr>
+            <w:pStyle w:val="TOC1"/>
+            <w:tabs>
+              <w:tab w:val="right" w:pos="9638" w:leader="dot"/>
+            </w:tabs>
+          </w:pPr>
+          <w:hyperlink w:history="1" w:anchor="_Toc3">
+            <w:r>
+              <w:t xml:space="preserve">2. Visão geral do cronograma</w:t>
+            </w:r>
+            <w:r>
+              <w:tab/>
+            </w:r>
+            <w:r>
+              <w:fldChar w:fldCharType="begin" w:dirty="true"/>
+              <w:instrText xml:space="preserve">PAGEREF _Toc3 \h</w:instrText>
+              <w:fldChar w:fldCharType="separate"/>
+              <w:fldChar w:fldCharType="end"/>
+            </w:r>
+          </w:hyperlink>
+        </w:p>
+        <w:p>
+          <w:pPr>
+            <w:pStyle w:val="TOC1"/>
+            <w:tabs>
+              <w:tab w:val="right" w:pos="9638" w:leader="dot"/>
+            </w:tabs>
+          </w:pPr>
+          <w:hyperlink w:history="1" w:anchor="_Toc4">
+            <w:r>
+              <w:t xml:space="preserve">3. Fases detalhadas</w:t>
+            </w:r>
+            <w:r>
+              <w:tab/>
+            </w:r>
+            <w:r>
+              <w:fldChar w:fldCharType="begin" w:dirty="true"/>
+              <w:instrText xml:space="preserve">PAGEREF _Toc4 \h</w:instrText>
+              <w:fldChar w:fldCharType="separate"/>
+              <w:fldChar w:fldCharType="end"/>
+            </w:r>
+          </w:hyperlink>
+        </w:p>
+        <w:p>
+          <w:pPr>
+            <w:pStyle w:val="TOC2"/>
+            <w:tabs>
+              <w:tab w:val="right" w:pos="9638" w:leader="dot"/>
+            </w:tabs>
+            <w:ind w:left="220"/>
+          </w:pPr>
+          <w:hyperlink w:history="1" w:anchor="_Toc5">
+            <w:r>
+              <w:t xml:space="preserve">Fase 0 — Fundação</w:t>
+            </w:r>
+            <w:r>
+              <w:tab/>
+            </w:r>
+            <w:r>
+              <w:fldChar w:fldCharType="begin" w:dirty="true"/>
+              <w:instrText xml:space="preserve">PAGEREF _Toc5 \h</w:instrText>
+              <w:fldChar w:fldCharType="separate"/>
+              <w:fldChar w:fldCharType="end"/>
+            </w:r>
+          </w:hyperlink>
+        </w:p>
+        <w:p>
+          <w:pPr>
+            <w:pStyle w:val="TOC3"/>
+            <w:tabs>
+              <w:tab w:val="right" w:pos="9638" w:leader="dot"/>
+            </w:tabs>
+            <w:ind w:left="440"/>
+          </w:pPr>
+          <w:hyperlink w:history="1" w:anchor="_Toc6">
+            <w:r>
+              <w:t xml:space="preserve">Entregáveis</w:t>
+            </w:r>
+            <w:r>
+              <w:tab/>
+            </w:r>
+            <w:r>
+              <w:fldChar w:fldCharType="begin" w:dirty="true"/>
+              <w:instrText xml:space="preserve">PAGEREF _Toc6 \h</w:instrText>
+              <w:fldChar w:fldCharType="separate"/>
+              <w:fldChar w:fldCharType="end"/>
+            </w:r>
+          </w:hyperlink>
+        </w:p>
+        <w:p>
+          <w:pPr>
+            <w:pStyle w:val="TOC2"/>
+            <w:tabs>
+              <w:tab w:val="right" w:pos="9638" w:leader="dot"/>
+            </w:tabs>
+            <w:ind w:left="220"/>
+          </w:pPr>
+          <w:hyperlink w:history="1" w:anchor="_Toc7">
+            <w:r>
+              <w:t xml:space="preserve">Fase 1 — Espinha dorsal nacional</w:t>
+            </w:r>
+            <w:r>
+              <w:tab/>
+            </w:r>
+            <w:r>
+              <w:fldChar w:fldCharType="begin" w:dirty="true"/>
+              <w:instrText xml:space="preserve">PAGEREF _Toc7 \h</w:instrText>
+              <w:fldChar w:fldCharType="separate"/>
+              <w:fldChar w:fldCharType="end"/>
+            </w:r>
+          </w:hyperlink>
+        </w:p>
+        <w:p>
+          <w:pPr>
+            <w:pStyle w:val="TOC3"/>
+            <w:tabs>
+              <w:tab w:val="right" w:pos="9638" w:leader="dot"/>
+            </w:tabs>
+            <w:ind w:left="440"/>
+          </w:pPr>
+          <w:hyperlink w:history="1" w:anchor="_Toc8">
+            <w:r>
+              <w:t xml:space="preserve">Entregáveis</w:t>
+            </w:r>
+            <w:r>
+              <w:tab/>
+            </w:r>
+            <w:r>
+              <w:fldChar w:fldCharType="begin" w:dirty="true"/>
+              <w:instrText xml:space="preserve">PAGEREF _Toc8 \h</w:instrText>
+              <w:fldChar w:fldCharType="separate"/>
+              <w:fldChar w:fldCharType="end"/>
+            </w:r>
+          </w:hyperlink>
+        </w:p>
+        <w:p>
+          <w:pPr>
+            <w:pStyle w:val="TOC2"/>
+            <w:tabs>
+              <w:tab w:val="right" w:pos="9638" w:leader="dot"/>
+            </w:tabs>
+            <w:ind w:left="220"/>
+          </w:pPr>
+          <w:hyperlink w:history="1" w:anchor="_Toc9">
+            <w:r>
+              <w:t xml:space="preserve">Fase 2 — Motor de detecção</w:t>
+            </w:r>
+            <w:r>
+              <w:tab/>
+            </w:r>
+            <w:r>
+              <w:fldChar w:fldCharType="begin" w:dirty="true"/>
+              <w:instrText xml:space="preserve">PAGEREF _Toc9 \h</w:instrText>
+              <w:fldChar w:fldCharType="separate"/>
+              <w:fldChar w:fldCharType="end"/>
+            </w:r>
+          </w:hyperlink>
+        </w:p>
+        <w:p>
+          <w:pPr>
+            <w:pStyle w:val="TOC3"/>
+            <w:tabs>
+              <w:tab w:val="right" w:pos="9638" w:leader="dot"/>
+            </w:tabs>
+            <w:ind w:left="440"/>
+          </w:pPr>
+          <w:hyperlink w:history="1" w:anchor="_Toc10">
+            <w:r>
+              <w:t xml:space="preserve">Entregáveis</w:t>
+            </w:r>
+            <w:r>
+              <w:tab/>
+            </w:r>
+            <w:r>
+              <w:fldChar w:fldCharType="begin" w:dirty="true"/>
+              <w:instrText xml:space="preserve">PAGEREF _Toc10 \h</w:instrText>
+              <w:fldChar w:fldCharType="separate"/>
+              <w:fldChar w:fldCharType="end"/>
+            </w:r>
+          </w:hyperlink>
+        </w:p>
+        <w:p>
+          <w:pPr>
+            <w:pStyle w:val="TOC2"/>
+            <w:tabs>
+              <w:tab w:val="right" w:pos="9638" w:leader="dot"/>
+            </w:tabs>
+            <w:ind w:left="220"/>
+          </w:pPr>
+          <w:hyperlink w:history="1" w:anchor="_Toc11">
+            <w:r>
+              <w:t xml:space="preserve">Fase 3 — Camada estadual</w:t>
+            </w:r>
+            <w:r>
+              <w:tab/>
+            </w:r>
+            <w:r>
+              <w:fldChar w:fldCharType="begin" w:dirty="true"/>
+              <w:instrText xml:space="preserve">PAGEREF _Toc11 \h</w:instrText>
+              <w:fldChar w:fldCharType="separate"/>
+              <w:fldChar w:fldCharType="end"/>
+            </w:r>
+          </w:hyperlink>
+        </w:p>
+        <w:p>
+          <w:pPr>
+            <w:pStyle w:val="TOC3"/>
+            <w:tabs>
+              <w:tab w:val="right" w:pos="9638" w:leader="dot"/>
+            </w:tabs>
+            <w:ind w:left="440"/>
+          </w:pPr>
+          <w:hyperlink w:history="1" w:anchor="_Toc12">
+            <w:r>
+              <w:t xml:space="preserve">Entregáveis</w:t>
+            </w:r>
+            <w:r>
+              <w:tab/>
+            </w:r>
+            <w:r>
+              <w:fldChar w:fldCharType="begin" w:dirty="true"/>
+              <w:instrText xml:space="preserve">PAGEREF _Toc12 \h</w:instrText>
+              <w:fldChar w:fldCharType="separate"/>
+              <w:fldChar w:fldCharType="end"/>
+            </w:r>
+          </w:hyperlink>
+        </w:p>
+        <w:p>
+          <w:pPr>
+            <w:pStyle w:val="TOC2"/>
+            <w:tabs>
+              <w:tab w:val="right" w:pos="9638" w:leader="dot"/>
+            </w:tabs>
+            <w:ind w:left="220"/>
+          </w:pPr>
+          <w:hyperlink w:history="1" w:anchor="_Toc13">
+            <w:r>
+              <w:t xml:space="preserve">Fase 4 — Cauda longa municipal</w:t>
+            </w:r>
+            <w:r>
+              <w:tab/>
+            </w:r>
+            <w:r>
+              <w:fldChar w:fldCharType="begin" w:dirty="true"/>
+              <w:instrText xml:space="preserve">PAGEREF _Toc13 \h</w:instrText>
+              <w:fldChar w:fldCharType="separate"/>
+              <w:fldChar w:fldCharType="end"/>
+            </w:r>
+          </w:hyperlink>
+        </w:p>
+        <w:p>
+          <w:pPr>
+            <w:pStyle w:val="TOC3"/>
+            <w:tabs>
+              <w:tab w:val="right" w:pos="9638" w:leader="dot"/>
+            </w:tabs>
+            <w:ind w:left="440"/>
+          </w:pPr>
+          <w:hyperlink w:history="1" w:anchor="_Toc14">
+            <w:r>
+              <w:t xml:space="preserve">Entregáveis</w:t>
+            </w:r>
+            <w:r>
+              <w:tab/>
+            </w:r>
+            <w:r>
+              <w:fldChar w:fldCharType="begin" w:dirty="true"/>
+              <w:instrText xml:space="preserve">PAGEREF _Toc14 \h</w:instrText>
+              <w:fldChar w:fldCharType="separate"/>
+              <w:fldChar w:fldCharType="end"/>
+            </w:r>
+          </w:hyperlink>
+        </w:p>
+        <w:p>
+          <w:pPr>
+            <w:pStyle w:val="TOC2"/>
+            <w:tabs>
+              <w:tab w:val="right" w:pos="9638" w:leader="dot"/>
+            </w:tabs>
+            <w:ind w:left="220"/>
+          </w:pPr>
+          <w:hyperlink w:history="1" w:anchor="_Toc15">
+            <w:r>
+              <w:t xml:space="preserve">Fase 5 — Publicação</w:t>
+            </w:r>
+            <w:r>
+              <w:tab/>
+            </w:r>
+            <w:r>
+              <w:fldChar w:fldCharType="begin" w:dirty="true"/>
+              <w:instrText xml:space="preserve">PAGEREF _Toc15 \h</w:instrText>
+              <w:fldChar w:fldCharType="separate"/>
+              <w:fldChar w:fldCharType="end"/>
+            </w:r>
+          </w:hyperlink>
+        </w:p>
+        <w:p>
+          <w:pPr>
+            <w:pStyle w:val="TOC3"/>
+            <w:tabs>
+              <w:tab w:val="right" w:pos="9638" w:leader="dot"/>
+            </w:tabs>
+            <w:ind w:left="440"/>
+          </w:pPr>
+          <w:hyperlink w:history="1" w:anchor="_Toc16">
+            <w:r>
+              <w:t xml:space="preserve">Entregáveis</w:t>
+            </w:r>
+            <w:r>
+              <w:tab/>
+            </w:r>
+            <w:r>
+              <w:fldChar w:fldCharType="begin" w:dirty="true"/>
+              <w:instrText xml:space="preserve">PAGEREF _Toc16 \h</w:instrText>
+              <w:fldChar w:fldCharType="separate"/>
+              <w:fldChar w:fldCharType="end"/>
+            </w:r>
+          </w:hyperlink>
+        </w:p>
+        <w:p>
+          <w:pPr>
+            <w:pStyle w:val="TOC2"/>
+            <w:tabs>
+              <w:tab w:val="right" w:pos="9638" w:leader="dot"/>
+            </w:tabs>
+            <w:ind w:left="220"/>
+          </w:pPr>
+          <w:hyperlink w:history="1" w:anchor="_Toc17">
+            <w:r>
+              <w:t xml:space="preserve">Fase 6 — Consolidação</w:t>
+            </w:r>
+            <w:r>
+              <w:tab/>
+            </w:r>
+            <w:r>
+              <w:fldChar w:fldCharType="begin" w:dirty="true"/>
+              <w:instrText xml:space="preserve">PAGEREF _Toc17 \h</w:instrText>
+              <w:fldChar w:fldCharType="separate"/>
+              <w:fldChar w:fldCharType="end"/>
+            </w:r>
+          </w:hyperlink>
+        </w:p>
+        <w:p>
+          <w:pPr>
+            <w:pStyle w:val="TOC3"/>
+            <w:tabs>
+              <w:tab w:val="right" w:pos="9638" w:leader="dot"/>
+            </w:tabs>
+            <w:ind w:left="440"/>
+          </w:pPr>
+          <w:hyperlink w:history="1" w:anchor="_Toc18">
+            <w:r>
+              <w:t xml:space="preserve">Entregáveis</w:t>
+            </w:r>
+            <w:r>
+              <w:tab/>
+            </w:r>
+            <w:r>
+              <w:fldChar w:fldCharType="begin" w:dirty="true"/>
+              <w:instrText xml:space="preserve">PAGEREF _Toc18 \h</w:instrText>
+              <w:fldChar w:fldCharType="separate"/>
+              <w:fldChar w:fldCharType="end"/>
+            </w:r>
+          </w:hyperlink>
+        </w:p>
+        <w:p>
+          <w:pPr>
+            <w:pStyle w:val="TOC1"/>
+            <w:tabs>
+              <w:tab w:val="right" w:pos="9638" w:leader="dot"/>
+            </w:tabs>
+          </w:pPr>
+          <w:hyperlink w:history="1" w:anchor="_Toc19">
+            <w:r>
+              <w:t xml:space="preserve">4. Marcos</w:t>
+            </w:r>
+            <w:r>
+              <w:tab/>
+            </w:r>
+            <w:r>
+              <w:fldChar w:fldCharType="begin" w:dirty="true"/>
+              <w:instrText xml:space="preserve">PAGEREF _Toc19 \h</w:instrText>
+              <w:fldChar w:fldCharType="separate"/>
+              <w:fldChar w:fldCharType="end"/>
+            </w:r>
+          </w:hyperlink>
+        </w:p>
+        <w:p>
+          <w:pPr>
+            <w:pStyle w:val="TOC1"/>
+            <w:tabs>
+              <w:tab w:val="right" w:pos="9638" w:leader="dot"/>
+            </w:tabs>
+          </w:pPr>
+          <w:hyperlink w:history="1" w:anchor="_Toc20">
+            <w:r>
+              <w:t xml:space="preserve">5. Esforço estimado</w:t>
+            </w:r>
+            <w:r>
+              <w:tab/>
+            </w:r>
+            <w:r>
+              <w:fldChar w:fldCharType="begin" w:dirty="true"/>
+              <w:instrText xml:space="preserve">PAGEREF _Toc20 \h</w:instrText>
+              <w:fldChar w:fldCharType="separate"/>
+              <w:fldChar w:fldCharType="end"/>
+            </w:r>
+          </w:hyperlink>
+        </w:p>
+        <w:p>
+          <w:pPr>
+            <w:pStyle w:val="TOC1"/>
+            <w:tabs>
+              <w:tab w:val="right" w:pos="9638" w:leader="dot"/>
+            </w:tabs>
+          </w:pPr>
+          <w:hyperlink w:history="1" w:anchor="_Toc21">
+            <w:r>
+              <w:t xml:space="preserve">6. Custos recorrentes estimados</w:t>
+            </w:r>
+            <w:r>
+              <w:tab/>
+            </w:r>
+            <w:r>
+              <w:fldChar w:fldCharType="begin" w:dirty="true"/>
+              <w:instrText xml:space="preserve">PAGEREF _Toc21 \h</w:instrText>
+              <w:fldChar w:fldCharType="separate"/>
+              <w:fldChar w:fldCharType="end"/>
+            </w:r>
+          </w:hyperlink>
+        </w:p>
+        <w:p>
+          <w:pPr>
+            <w:pStyle w:val="TOC1"/>
+            <w:tabs>
+              <w:tab w:val="right" w:pos="9638" w:leader="dot"/>
+            </w:tabs>
+          </w:pPr>
+          <w:hyperlink w:history="1" w:anchor="_Toc22">
+            <w:r>
+              <w:t xml:space="preserve">7. Decisões que precisam ser tomadas antes de começar</w:t>
+            </w:r>
+            <w:r>
+              <w:tab/>
+            </w:r>
+            <w:r>
+              <w:fldChar w:fldCharType="begin" w:dirty="true"/>
+              <w:instrText xml:space="preserve">PAGEREF _Toc22 \h</w:instrText>
+              <w:fldChar w:fldCharType="separate"/>
+              <w:fldChar w:fldCharType="end"/>
+            </w:r>
+          </w:hyperlink>
+        </w:p>
+        <w:p>
+          <w:pPr>
+            <w:pStyle w:val="TOC1"/>
+            <w:tabs>
+              <w:tab w:val="right" w:pos="9638" w:leader="dot"/>
+            </w:tabs>
+          </w:pPr>
+          <w:hyperlink w:history="1" w:anchor="_Toc23">
+            <w:r>
+              <w:t xml:space="preserve">8. Critérios de replanejamento</w:t>
+            </w:r>
+            <w:r>
+              <w:tab/>
+            </w:r>
+            <w:r>
+              <w:fldChar w:fldCharType="begin" w:dirty="true"/>
+              <w:instrText xml:space="preserve">PAGEREF _Toc23 \h</w:instrText>
+              <w:fldChar w:fldCharType="separate"/>
+              <w:fldChar w:fldCharType="end"/>
+            </w:r>
+          </w:hyperlink>
+        </w:p>
+        <w:p>
+          <w:pPr>
+            <w:pStyle w:val="TOC1"/>
+            <w:tabs>
+              <w:tab w:val="right" w:pos="9638" w:leader="dot"/>
+            </w:tabs>
+          </w:pPr>
+          <w:hyperlink w:history="1" w:anchor="_Toc24">
+            <w:r>
+              <w:t xml:space="preserve">9. Situação em 20 de outubro de 2026</w:t>
+            </w:r>
+            <w:r>
+              <w:tab/>
+            </w:r>
+            <w:r>
+              <w:fldChar w:fldCharType="begin" w:dirty="true"/>
+              <w:instrText xml:space="preserve">PAGEREF _Toc24 \h</w:instrText>
+              <w:fldChar w:fldCharType="separate"/>
+              <w:fldChar w:fldCharType="end"/>
+            </w:r>
+          </w:hyperlink>
+        </w:p>
+        <w:p>
+          <w:pPr>
+            <w:pStyle w:val="TOC2"/>
+            <w:tabs>
+              <w:tab w:val="right" w:pos="9638" w:leader="dot"/>
+            </w:tabs>
+            <w:ind w:left="220"/>
+          </w:pPr>
+          <w:hyperlink w:history="1" w:anchor="_Toc25">
+            <w:r>
+              <w:t xml:space="preserve">9.1 Fase 0 — Fundação: concluída</w:t>
+            </w:r>
+            <w:r>
+              <w:tab/>
+            </w:r>
+            <w:r>
+              <w:fldChar w:fldCharType="begin" w:dirty="true"/>
+              <w:instrText xml:space="preserve">PAGEREF _Toc25 \h</w:instrText>
+              <w:fldChar w:fldCharType="separate"/>
+              <w:fldChar w:fldCharType="end"/>
+            </w:r>
+          </w:hyperlink>
+        </w:p>
+        <w:p>
+          <w:pPr>
+            <w:pStyle w:val="TOC2"/>
+            <w:tabs>
+              <w:tab w:val="right" w:pos="9638" w:leader="dot"/>
+            </w:tabs>
+            <w:ind w:left="220"/>
+          </w:pPr>
+          <w:hyperlink w:history="1" w:anchor="_Toc26">
+            <w:r>
+              <w:t xml:space="preserve">9.2 Fase 1 — Espinha dorsal nacional: núcleo pronto</w:t>
+            </w:r>
+            <w:r>
+              <w:tab/>
+            </w:r>
+            <w:r>
+              <w:fldChar w:fldCharType="begin" w:dirty="true"/>
+              <w:instrText xml:space="preserve">PAGEREF _Toc26 \h</w:instrText>
+              <w:fldChar w:fldCharType="separate"/>
+              <w:fldChar w:fldCharType="end"/>
+            </w:r>
+          </w:hyperlink>
+        </w:p>
+        <w:p>
+          <w:pPr>
+            <w:pStyle w:val="TOC2"/>
+            <w:tabs>
+              <w:tab w:val="right" w:pos="9638" w:leader="dot"/>
+            </w:tabs>
+            <w:ind w:left="220"/>
+          </w:pPr>
+          <w:hyperlink w:history="1" w:anchor="_Toc27">
+            <w:r>
+              <w:t xml:space="preserve">9.3 Trilha paralela: aba Eleições</w:t>
+            </w:r>
+            <w:r>
+              <w:tab/>
+            </w:r>
+            <w:r>
+              <w:fldChar w:fldCharType="begin" w:dirty="true"/>
+              <w:instrText xml:space="preserve">PAGEREF _Toc27 \h</w:instrText>
+              <w:fldChar w:fldCharType="separate"/>
+              <w:fldChar w:fldCharType="end"/>
+            </w:r>
+          </w:hyperlink>
+        </w:p>
+        <w:p>
+          <w:pPr>
+            <w:pStyle w:val="TOC2"/>
+            <w:tabs>
+              <w:tab w:val="right" w:pos="9638" w:leader="dot"/>
+            </w:tabs>
+            <w:ind w:left="220"/>
+          </w:pPr>
+          <w:hyperlink w:history="1" w:anchor="_Toc28">
+            <w:r>
+              <w:t xml:space="preserve">9.4 Efeito no cronograma</w:t>
+            </w:r>
+            <w:r>
+              <w:tab/>
+            </w:r>
+            <w:r>
+              <w:fldChar w:fldCharType="begin" w:dirty="true"/>
+              <w:instrText xml:space="preserve">PAGEREF _Toc28 \h</w:instrText>
+              <w:fldChar w:fldCharType="separate"/>
+              <w:fldChar w:fldCharType="end"/>
+            </w:r>
+          </w:hyperlink>
+        </w:p>
+        <w:p>
+          <w:pPr>
+            <w:pStyle w:val="TOC2"/>
+            <w:tabs>
+              <w:tab w:val="right" w:pos="9638" w:leader="dot"/>
+            </w:tabs>
+            <w:ind w:left="220"/>
+          </w:pPr>
+          <w:hyperlink w:history="1" w:anchor="_Toc29">
+            <w:r>
+              <w:t xml:space="preserve">9.5 Hospedagem sem custo (ADR-026)</w:t>
+            </w:r>
+            <w:r>
+              <w:tab/>
+            </w:r>
+            <w:r>
+              <w:fldChar w:fldCharType="begin" w:dirty="true"/>
+              <w:instrText xml:space="preserve">PAGEREF _Toc29 \h</w:instrText>
+              <w:fldChar w:fldCharType="separate"/>
+              <w:fldChar w:fldCharType="end"/>
+            </w:r>
+          </w:hyperlink>
         </w:p>
         <w:p>
           <w:r>
@@ -477,9 +1134,11 @@
         <w:keepLines/>
         <w:spacing w:after="160" w:before="380"/>
       </w:pPr>
+      <w:bookmarkStart w:name="_Toc2" w:id="2"/>
       <w:r>
         <w:t xml:space="preserve">1. Estratégia do plano</w:t>
       </w:r>
+      <w:bookmarkEnd w:id="2"/>
     </w:p>
     <w:p>
       <w:pPr>
@@ -624,9 +1283,11 @@
         <w:keepLines/>
         <w:spacing w:after="160" w:before="380"/>
       </w:pPr>
+      <w:bookmarkStart w:name="_Toc3" w:id="3"/>
       <w:r>
         <w:t xml:space="preserve">2. Visão geral do cronograma</w:t>
       </w:r>
+      <w:bookmarkEnd w:id="3"/>
     </w:p>
     <w:p>
       <w:pPr>
@@ -702,9 +1363,11 @@
         <w:keepLines/>
         <w:spacing w:after="160" w:before="380"/>
       </w:pPr>
+      <w:bookmarkStart w:name="_Toc4" w:id="4"/>
       <w:r>
         <w:t xml:space="preserve">3. Fases detalhadas</w:t>
       </w:r>
+      <w:bookmarkEnd w:id="4"/>
     </w:p>
     <w:p>
       <w:pPr>
@@ -713,9 +1376,11 @@
         <w:keepLines/>
         <w:spacing w:after="120" w:before="280"/>
       </w:pPr>
+      <w:bookmarkStart w:name="_Toc5" w:id="5"/>
       <w:r>
         <w:t xml:space="preserve">Fase 0 — Fundação</w:t>
       </w:r>
+      <w:bookmarkEnd w:id="5"/>
     </w:p>
     <w:tbl>
       <w:tblPr>
@@ -977,9 +1642,11 @@
         <w:keepLines/>
         <w:spacing w:after="100" w:before="220"/>
       </w:pPr>
+      <w:bookmarkStart w:name="_Toc6" w:id="6"/>
       <w:r>
         <w:t xml:space="preserve">Entregáveis</w:t>
       </w:r>
+      <w:bookmarkEnd w:id="6"/>
     </w:p>
     <w:p>
       <w:pPr>
@@ -1071,9 +1738,11 @@
         <w:keepLines/>
         <w:spacing w:after="120" w:before="280"/>
       </w:pPr>
+      <w:bookmarkStart w:name="_Toc7" w:id="7"/>
       <w:r>
         <w:t xml:space="preserve">Fase 1 — Espinha dorsal nacional</w:t>
       </w:r>
+      <w:bookmarkEnd w:id="7"/>
     </w:p>
     <w:tbl>
       <w:tblPr>
@@ -1335,9 +2004,11 @@
         <w:keepLines/>
         <w:spacing w:after="100" w:before="220"/>
       </w:pPr>
+      <w:bookmarkStart w:name="_Toc8" w:id="8"/>
       <w:r>
         <w:t xml:space="preserve">Entregáveis</w:t>
       </w:r>
+      <w:bookmarkEnd w:id="8"/>
     </w:p>
     <w:p>
       <w:pPr>
@@ -1455,9 +2126,11 @@
         <w:keepLines/>
         <w:spacing w:after="120" w:before="280"/>
       </w:pPr>
+      <w:bookmarkStart w:name="_Toc9" w:id="9"/>
       <w:r>
         <w:t xml:space="preserve">Fase 2 — Motor de detecção</w:t>
       </w:r>
+      <w:bookmarkEnd w:id="9"/>
     </w:p>
     <w:tbl>
       <w:tblPr>
@@ -1719,9 +2392,11 @@
         <w:keepLines/>
         <w:spacing w:after="100" w:before="220"/>
       </w:pPr>
+      <w:bookmarkStart w:name="_Toc10" w:id="10"/>
       <w:r>
         <w:t xml:space="preserve">Entregáveis</w:t>
       </w:r>
+      <w:bookmarkEnd w:id="10"/>
     </w:p>
     <w:p>
       <w:pPr>
@@ -1839,9 +2514,11 @@
         <w:keepLines/>
         <w:spacing w:after="120" w:before="280"/>
       </w:pPr>
+      <w:bookmarkStart w:name="_Toc11" w:id="11"/>
       <w:r>
         <w:t xml:space="preserve">Fase 3 — Camada estadual</w:t>
       </w:r>
+      <w:bookmarkEnd w:id="11"/>
     </w:p>
     <w:tbl>
       <w:tblPr>
@@ -2103,9 +2780,11 @@
         <w:keepLines/>
         <w:spacing w:after="100" w:before="220"/>
       </w:pPr>
+      <w:bookmarkStart w:name="_Toc12" w:id="12"/>
       <w:r>
         <w:t xml:space="preserve">Entregáveis</w:t>
       </w:r>
+      <w:bookmarkEnd w:id="12"/>
     </w:p>
     <w:p>
       <w:pPr>
@@ -2184,9 +2863,11 @@
         <w:keepLines/>
         <w:spacing w:after="120" w:before="280"/>
       </w:pPr>
+      <w:bookmarkStart w:name="_Toc13" w:id="13"/>
       <w:r>
         <w:t xml:space="preserve">Fase 4 — Cauda longa municipal</w:t>
       </w:r>
+      <w:bookmarkEnd w:id="13"/>
     </w:p>
     <w:tbl>
       <w:tblPr>
@@ -2448,9 +3129,11 @@
         <w:keepLines/>
         <w:spacing w:after="100" w:before="220"/>
       </w:pPr>
+      <w:bookmarkStart w:name="_Toc14" w:id="14"/>
       <w:r>
         <w:t xml:space="preserve">Entregáveis</w:t>
       </w:r>
+      <w:bookmarkEnd w:id="14"/>
     </w:p>
     <w:p>
       <w:pPr>
@@ -2529,9 +3212,11 @@
         <w:keepLines/>
         <w:spacing w:after="120" w:before="280"/>
       </w:pPr>
+      <w:bookmarkStart w:name="_Toc15" w:id="15"/>
       <w:r>
         <w:t xml:space="preserve">Fase 5 — Publicação</w:t>
       </w:r>
+      <w:bookmarkEnd w:id="15"/>
     </w:p>
     <w:tbl>
       <w:tblPr>
@@ -2793,9 +3478,11 @@
         <w:keepLines/>
         <w:spacing w:after="100" w:before="220"/>
       </w:pPr>
+      <w:bookmarkStart w:name="_Toc16" w:id="16"/>
       <w:r>
         <w:t xml:space="preserve">Entregáveis</w:t>
       </w:r>
+      <w:bookmarkEnd w:id="16"/>
     </w:p>
     <w:p>
       <w:pPr>
@@ -2900,9 +3587,11 @@
         <w:keepLines/>
         <w:spacing w:after="120" w:before="280"/>
       </w:pPr>
+      <w:bookmarkStart w:name="_Toc17" w:id="17"/>
       <w:r>
         <w:t xml:space="preserve">Fase 6 — Consolidação</w:t>
       </w:r>
+      <w:bookmarkEnd w:id="17"/>
     </w:p>
     <w:tbl>
       <w:tblPr>
@@ -3164,9 +3853,11 @@
         <w:keepLines/>
         <w:spacing w:after="100" w:before="220"/>
       </w:pPr>
+      <w:bookmarkStart w:name="_Toc18" w:id="18"/>
       <w:r>
         <w:t xml:space="preserve">Entregáveis</w:t>
       </w:r>
+      <w:bookmarkEnd w:id="18"/>
     </w:p>
     <w:p>
       <w:pPr>
@@ -3250,9 +3941,11 @@
         <w:keepLines/>
         <w:spacing w:after="160" w:before="380"/>
       </w:pPr>
+      <w:bookmarkStart w:name="_Toc19" w:id="19"/>
       <w:r>
         <w:t xml:space="preserve">4. Marcos</w:t>
       </w:r>
+      <w:bookmarkEnd w:id="19"/>
     </w:p>
     <w:tbl>
       <w:tblPr>
@@ -3884,9 +4577,11 @@
         <w:keepLines/>
         <w:spacing w:after="160" w:before="380"/>
       </w:pPr>
+      <w:bookmarkStart w:name="_Toc20" w:id="20"/>
       <w:r>
         <w:t xml:space="preserve">5. Esforço estimado</w:t>
       </w:r>
+      <w:bookmarkEnd w:id="20"/>
     </w:p>
     <w:p>
       <w:pPr>
@@ -4758,9 +5453,11 @@
         <w:keepLines/>
         <w:spacing w:after="160" w:before="380"/>
       </w:pPr>
+      <w:bookmarkStart w:name="_Toc21" w:id="21"/>
       <w:r>
         <w:t xml:space="preserve">6. Custos recorrentes estimados</w:t>
       </w:r>
+      <w:bookmarkEnd w:id="21"/>
     </w:p>
     <w:p>
       <w:pPr>
@@ -5743,9 +6440,11 @@
         <w:keepLines/>
         <w:spacing w:after="160" w:before="380"/>
       </w:pPr>
+      <w:bookmarkStart w:name="_Toc22" w:id="22"/>
       <w:r>
         <w:t xml:space="preserve">7. Decisões que precisam ser tomadas antes de começar</w:t>
       </w:r>
+      <w:bookmarkEnd w:id="22"/>
     </w:p>
     <w:p>
       <w:pPr>
@@ -6219,9 +6918,11 @@
         <w:keepLines/>
         <w:spacing w:after="160" w:before="380"/>
       </w:pPr>
+      <w:bookmarkStart w:name="_Toc23" w:id="23"/>
       <w:r>
         <w:t xml:space="preserve">8. Critérios de replanejamento</w:t>
       </w:r>
+      <w:bookmarkEnd w:id="23"/>
     </w:p>
     <w:p>
       <w:pPr>
@@ -6359,9 +7060,11 @@
         <w:pageBreakBefore/>
         <w:spacing w:after="160" w:before="380"/>
       </w:pPr>
+      <w:bookmarkStart w:name="_Toc24" w:id="24"/>
       <w:r>
         <w:t xml:space="preserve">9. Situação em 20 de outubro de 2026</w:t>
       </w:r>
+      <w:bookmarkEnd w:id="24"/>
     </w:p>
     <w:p>
       <w:pPr>
@@ -6384,9 +7087,11 @@
         <w:keepLines/>
         <w:spacing w:after="120" w:before="280"/>
       </w:pPr>
+      <w:bookmarkStart w:name="_Toc25" w:id="25"/>
       <w:r>
         <w:t xml:space="preserve">9.1 Fase 0 — Fundação: concluída</w:t>
       </w:r>
+      <w:bookmarkEnd w:id="25"/>
     </w:p>
     <w:tbl>
       <w:tblPr>
@@ -6886,9 +7591,11 @@
         <w:keepLines/>
         <w:spacing w:after="120" w:before="280"/>
       </w:pPr>
+      <w:bookmarkStart w:name="_Toc26" w:id="26"/>
       <w:r>
         <w:t xml:space="preserve">9.2 Fase 1 — Espinha dorsal nacional: núcleo pronto</w:t>
       </w:r>
+      <w:bookmarkEnd w:id="26"/>
     </w:p>
     <w:tbl>
       <w:tblPr>
@@ -7434,7 +8141,7 @@
                 <w:sz w:val="17"/>
                 <w:szCs w:val="17"/>
               </w:rPr>
-              <w:t xml:space="preserve">Concluído (ADR-039): página pública "Situação das coletas" com as execuções dos fluxos, o volume diário do PNCP contra o usual (alarme de queda, sem falso positivo em 172 dias úteis de 2026) e a coleta da conformidade; limiares iniciais</w:t>
+              <w:t xml:space="preserve">Concluído (ADR-039): página pública "Situação das coletas" com as execuções dos fluxos, o volume diário do PNCP contra o usual (alarme de queda, sem falso positivo em 172 dias úteis de 2026) e a coleta da conformidade e a cobertura por ente e UF (ADR-048); limiares iniciais</w:t>
             </w:r>
           </w:p>
         </w:tc>
@@ -7788,7 +8495,7 @@
                 <w:sz w:val="17"/>
                 <w:szCs w:val="17"/>
               </w:rPr>
-              <w:t xml:space="preserve">Não iniciado. A hospedagem está decidida (ADR-026); faltam o projeto no Supabase e levar a coleta de contratações para a nuvem</w:t>
+              <w:t xml:space="preserve">Em andamento. O relatório de cobertura por ente e UF está publicado na "Situação das coletas" (ADR-048), e a carga das contratações e da conformidade desde 2021 está em curso no GitHub Actions (ADR-046)</w:t>
             </w:r>
           </w:p>
         </w:tc>
@@ -7868,9 +8575,11 @@
         <w:keepLines/>
         <w:spacing w:after="120" w:before="280"/>
       </w:pPr>
+      <w:bookmarkStart w:name="_Toc27" w:id="27"/>
       <w:r>
         <w:t xml:space="preserve">9.3 Trilha paralela: aba Eleições</w:t>
       </w:r>
+      <w:bookmarkEnd w:id="27"/>
     </w:p>
     <w:p>
       <w:pPr>
@@ -8502,9 +9211,11 @@
         <w:keepLines/>
         <w:spacing w:after="120" w:before="280"/>
       </w:pPr>
+      <w:bookmarkStart w:name="_Toc28" w:id="28"/>
       <w:r>
         <w:t xml:space="preserve">9.4 Efeito no cronograma</w:t>
       </w:r>
+      <w:bookmarkEnd w:id="28"/>
     </w:p>
     <w:p>
       <w:pPr>
@@ -8527,9 +9238,11 @@
         <w:keepLines/>
         <w:spacing w:after="120" w:before="280"/>
       </w:pPr>
+      <w:bookmarkStart w:name="_Toc29" w:id="29"/>
       <w:r>
         <w:t xml:space="preserve">9.5 Hospedagem sem custo (ADR-026)</w:t>
       </w:r>
+      <w:bookmarkEnd w:id="29"/>
     </w:p>
     <w:p>
       <w:pPr>
@@ -9477,6 +10190,21 @@
   <w:style w:type="paragraph" w:styleId="Normal" w:default="1">
     <w:name w:val="Normal"/>
     <w:qFormat/>
+  </w:style>
+  <w:style w:type="table" w:styleId="TableNormal" w:default="true">
+    <w:name w:val="Normal Table"/>
+    <w:uiPriority w:val="99"/>
+    <w:semiHidden/>
+    <w:unhideWhenUsed/>
+    <w:tblPr>
+      <w:tblInd w:type="dxa" w:w="0"/>
+      <w:tblCellMar>
+        <w:top w:type="dxa" w:w="0"/>
+        <w:left w:type="dxa" w:w="108"/>
+        <w:bottom w:type="dxa" w:w="0"/>
+        <w:right w:type="dxa" w:w="108"/>
+      </w:tblCellMar>
+    </w:tblPr>
   </w:style>
   <w:style w:type="paragraph" w:styleId="Title">
     <w:name w:val="Title"/>

</xml_diff>

<commit_message>
docs: o Lumen é produto da Falkyria, com código proprietário
Registra as duas definições do DOC-10 decididas pelo autor em 30/10: a
natureza institucional (produto da empresa Falkyria) e a abertura do código
(proprietário, visível só para consulta, como na LICENSE do #37). O
CONTRIBUTING e a Wiki passam a dizer que contribuição de fora só entra com
cessão de direitos por escrito (#18).
</commit_message>
<xml_diff>
--- a/docs/DOC-10_Roadmap.docx
+++ b/docs/DOC-10_Roadmap.docx
@@ -6756,7 +6756,7 @@
                 <w:sz w:val="19"/>
                 <w:szCs w:val="19"/>
               </w:rPr>
-              <w:t xml:space="preserve">Projeto pessoal, produto da empresa ou iniciativa sem fins lucrativos; afeta percepção de imparcialidade e a estratégia de sustentação</w:t>
+              <w:t xml:space="preserve">Decidido em 30/10/2026: o Lumen é produto da empresa Falkyria. A imparcialidade fica a cargo da metodologia pública, do vocabulário controlado e da contestação aberta (DOC-08)</w:t>
             </w:r>
           </w:p>
         </w:tc>
@@ -6842,7 +6842,7 @@
                 <w:sz w:val="19"/>
                 <w:szCs w:val="19"/>
               </w:rPr>
-              <w:t xml:space="preserve">Código aberto reforça a credibilidade da metodologia e atrai colaboração, mas exige disciplina adicional de documentação e governança</w:t>
+              <w:t xml:space="preserve">Decidido em 30/10/2026: código proprietário da Falkyria, visível apenas para consulta (LICENSE); a metodologia segue documentada em público</w:t>
             </w:r>
           </w:p>
         </w:tc>

</xml_diff>

<commit_message>
Fase 1: critério de saída cumprido, com a carga desde 2021 (ADR-046, adendo)
Os 1.915 dias do PNCP de 1º/8/2021 a 28/10/2026 e a conformidade das 27 UFs
(5.597 entes) de 2021 a 2026 estão guardados; com o relatório de cobertura
por ente e UF (ADR-048), a Fase 1 cumpre o critério do DOC-10 e o marco M2.
Falta, dos entregáveis, a despesa do Portal da Transparência (#36).
</commit_message>
<xml_diff>
--- a/docs/DOC-10_Roadmap.docx
+++ b/docs/DOC-10_Roadmap.docx
@@ -1033,7 +1033,7 @@
           </w:pPr>
           <w:hyperlink w:history="1" w:anchor="_Toc26">
             <w:r>
-              <w:t xml:space="preserve">9.2 Fase 1 — Espinha dorsal nacional: núcleo pronto</w:t>
+              <w:t xml:space="preserve">9.2 Fase 1 — Espinha dorsal nacional: critério de saída cumprido</w:t>
             </w:r>
             <w:r>
               <w:tab/>
@@ -1285,7 +1285,7 @@
                 <w:bCs/>
                 <w:color w:val="000000"/>
               </w:rPr>
-              <w:t xml:space="preserve">Situação em 6 de outubro de 2026</w:t>
+              <w:t xml:space="preserve">Situação em 30 de outubro de 2026</w:t>
             </w:r>
           </w:p>
           <w:p>
@@ -1293,7 +1293,7 @@
               <w:spacing w:after="70"/>
             </w:pPr>
             <w:r>
-              <w:t xml:space="preserve">Fase 0 concluída (marco M1 verificado por teste). Fase 1 com o núcleo pronto: PNCP, SICONFI e IBGE coletados, normalizados e reconstruíveis a partir da prova. Aba Eleições pronta como trilha paralela. O detalhamento, com o que falta em cada fase, está na seção 9.</w:t>
+              <w:t xml:space="preserve">Fase 0 concluída (marco M1 verificado por teste). Fase 1 com o critério de saída cumprido (marco M2): 1.915 dias do PNCP, de 1º/8/2021 a 28/10/2026, e a conformidade das 27 UFs e dos 5.597 entes nos exercícios de 2021 a 2026, com o relatório de cobertura por ente e UF. Fase 3 iniciada, com quatro tribunais de contas. Aba Eleições pronta como trilha paralela. O detalhamento, com o que falta em cada fase, está na seção 9.</w:t>
             </w:r>
           </w:p>
         </w:tc>
@@ -4157,7 +4157,7 @@
                 <w:sz w:val="19"/>
                 <w:szCs w:val="19"/>
               </w:rPr>
-              <w:t xml:space="preserve">Prova preservada: um artefato é coletado, armazenado com hash e recuperado</w:t>
+              <w:t xml:space="preserve">Prova preservada: um artefato é coletado, armazenado com hash e recuperado. Cumprido</w:t>
             </w:r>
           </w:p>
         </w:tc>
@@ -4243,7 +4243,7 @@
                 <w:sz w:val="19"/>
                 <w:szCs w:val="19"/>
               </w:rPr>
-              <w:t xml:space="preserve">Cobertura nacional: contratações e dados fiscais de alcance nacional na base</w:t>
+              <w:t xml:space="preserve">Cobertura nacional: contratações e dados fiscais de alcance nacional na base. Cumprido em 30/10/2026</w:t>
             </w:r>
           </w:p>
         </w:tc>
@@ -7616,7 +7616,7 @@
       </w:pPr>
       <w:bookmarkStart w:name="_Toc26" w:id="26"/>
       <w:r>
-        <w:t xml:space="preserve">9.2 Fase 1 — Espinha dorsal nacional: núcleo pronto</w:t>
+        <w:t xml:space="preserve">9.2 Fase 1 — Espinha dorsal nacional: critério de saída cumprido</w:t>
       </w:r>
       <w:bookmarkEnd w:id="26"/>
     </w:p>
@@ -7869,7 +7869,7 @@
                 <w:sz w:val="17"/>
                 <w:szCs w:val="17"/>
               </w:rPr>
-              <w:t xml:space="preserve">Cadastros de sanções concluídos: coleta diária pelos arquivos de dados abertos, sem chave, e normalização com CPF mascarado (ADR-030); emendas parlamentares e convênios pelos arquivos de dados abertos, sem chave (ADR-044 e ADR-045); transferências e despesas pendentes, pelo mesmo caminho</w:t>
+              <w:t xml:space="preserve">Cadastros de sanções concluídos: coleta diária pelos arquivos de dados abertos, sem chave, e normalização com CPF mascarado (ADR-030); emendas parlamentares e convênios pelos arquivos de dados abertos, sem chave (ADR-044 e ADR-045); transferências da União (ADR-054) também; despesas pendentes, pelo mesmo caminho (#36)</w:t>
             </w:r>
           </w:p>
         </w:tc>
@@ -8518,7 +8518,7 @@
                 <w:sz w:val="17"/>
                 <w:szCs w:val="17"/>
               </w:rPr>
-              <w:t xml:space="preserve">Em andamento. O relatório de cobertura por ente e UF está publicado na "Situação das coletas" (ADR-048), e a carga das contratações e da conformidade desde 2021 está em curso no GitHub Actions (ADR-046)</w:t>
+              <w:t xml:space="preserve">Cumprido em 30/10/2026: 1.915 dias do PNCP, de 1º/8/2021 a 28/10/2026, e a conformidade das 27 UFs e dos 5.597 entes nos exercícios de 2021 a 2026 (ADR-046), com o relatório de cobertura por ente e UF na "Situação das coletas" (ADR-048)</w:t>
             </w:r>
           </w:p>
         </w:tc>

</xml_diff>